<commit_message>
Expand CV consulting and website portfolio
</commit_message>
<xml_diff>
--- a/output/docx/Phil_Stilwell_Modern_CV.docx
+++ b/output/docx/Phil_Stilwell_Modern_CV.docx
@@ -195,6 +195,23 @@
           <w:sz w:val="20"/>
         </w:rPr>
         <w:t>Prepare students entering overseas MBA and graduate programs; deliver corporate English training and private Zoom instruction in English and core business concepts.</w:t>
+      </w:r>
+    </w:p>
+    <w:p>
+      <w:pPr>
+        <w:pStyle w:val="CVBullet"/>
+        <w:numPr>
+          <w:ilvl w:val="0"/>
+          <w:numId w:val="10"/>
+        </w:numPr>
+      </w:pPr>
+      <w:r>
+        <w:rPr>
+          <w:rFonts w:ascii="Calibri" w:hAnsi="Calibri" w:eastAsia="Calibri"/>
+          <w:color w:val="243447"/>
+          <w:sz w:val="20"/>
+        </w:rPr>
+        <w:t>Teach practical AI technologies and provide individualized life coaching alongside academic and professional-development services.</w:t>
       </w:r>
     </w:p>
     <w:p>
@@ -1259,6 +1276,388 @@
         <w:pBdr>
           <w:bottom w:val="single" w:sz="8" w:space="3" w:color="B7CFD2"/>
         </w:pBdr>
+        <w:spacing w:before="160" w:after="80"/>
+      </w:pPr>
+      <w:r>
+        <w:rPr>
+          <w:rFonts w:ascii="Calibri" w:hAnsi="Calibri" w:eastAsia="Calibri"/>
+          <w:b/>
+          <w:color w:val="087E8B"/>
+          <w:sz w:val="26"/>
+        </w:rPr>
+        <w:t>SELECTED WEBSITES</w:t>
+      </w:r>
+    </w:p>
+    <w:p>
+      <w:pPr>
+        <w:pStyle w:val="CVSummary"/>
+        <w:keepLines/>
+        <w:tabs>
+          <w:tab w:pos="2520" w:val="left"/>
+        </w:tabs>
+        <w:spacing w:before="0" w:after="20" w:line="240" w:lineRule="auto"/>
+      </w:pPr>
+      <w:r>
+        <w:rPr>
+          <w:rFonts w:ascii="Calibri" w:hAnsi="Calibri" w:eastAsia="Calibri"/>
+          <w:b/>
+          <w:i w:val="0"/>
+          <w:color w:val="17324D"/>
+          <w:sz w:val="18"/>
+        </w:rPr>
+        <w:t>Academic profiles</w:t>
+      </w:r>
+      <w:r>
+        <w:rPr>
+          <w:rFonts w:ascii="Calibri" w:hAnsi="Calibri" w:eastAsia="Calibri"/>
+          <w:b w:val="0"/>
+          <w:i w:val="0"/>
+          <w:color w:val="5D6A75"/>
+          <w:sz w:val="18"/>
+        </w:rPr>
+        <w:tab/>
+      </w:r>
+      <w:hyperlink r:id="rId16">
+        <w:r>
+          <w:rPr>
+            <w:rFonts w:ascii="Calibri" w:hAnsi="Calibri"/>
+            <w:color w:val="087E8B"/>
+            <w:sz w:val="18"/>
+            <w:b/>
+            <w:u w:val="none"/>
+          </w:rPr>
+          <w:t>Academia.edu profile</w:t>
+        </w:r>
+      </w:hyperlink>
+      <w:r>
+        <w:rPr>
+          <w:rFonts w:ascii="Calibri" w:hAnsi="Calibri" w:eastAsia="Calibri"/>
+          <w:b w:val="0"/>
+          <w:i w:val="0"/>
+          <w:color w:val="5D6A75"/>
+          <w:sz w:val="18"/>
+        </w:rPr>
+        <w:t xml:space="preserve">  |  </w:t>
+      </w:r>
+      <w:hyperlink r:id="rId17">
+        <w:r>
+          <w:rPr>
+            <w:rFonts w:ascii="Calibri" w:hAnsi="Calibri"/>
+            <w:color w:val="087E8B"/>
+            <w:sz w:val="18"/>
+            <w:b/>
+            <w:u w:val="none"/>
+          </w:rPr>
+          <w:t>PhilPeople profile</w:t>
+        </w:r>
+      </w:hyperlink>
+    </w:p>
+    <w:p>
+      <w:pPr>
+        <w:pStyle w:val="CVSummary"/>
+        <w:keepLines/>
+        <w:tabs>
+          <w:tab w:pos="2520" w:val="left"/>
+        </w:tabs>
+        <w:spacing w:before="0" w:after="20" w:line="240" w:lineRule="auto"/>
+      </w:pPr>
+      <w:r>
+        <w:rPr>
+          <w:rFonts w:ascii="Calibri" w:hAnsi="Calibri" w:eastAsia="Calibri"/>
+          <w:b/>
+          <w:i w:val="0"/>
+          <w:color w:val="17324D"/>
+          <w:sz w:val="18"/>
+        </w:rPr>
+        <w:t>ESL</w:t>
+      </w:r>
+      <w:r>
+        <w:rPr>
+          <w:rFonts w:ascii="Calibri" w:hAnsi="Calibri" w:eastAsia="Calibri"/>
+          <w:b w:val="0"/>
+          <w:i w:val="0"/>
+          <w:color w:val="5D6A75"/>
+          <w:sz w:val="18"/>
+        </w:rPr>
+        <w:tab/>
+      </w:r>
+      <w:hyperlink r:id="rId18">
+        <w:r>
+          <w:rPr>
+            <w:rFonts w:ascii="Calibri" w:hAnsi="Calibri"/>
+            <w:color w:val="087E8B"/>
+            <w:sz w:val="18"/>
+            <w:b/>
+            <w:u w:val="none"/>
+          </w:rPr>
+          <w:t>englishladder.com</w:t>
+        </w:r>
+      </w:hyperlink>
+      <w:r>
+        <w:rPr>
+          <w:rFonts w:ascii="Calibri" w:hAnsi="Calibri" w:eastAsia="Calibri"/>
+          <w:b w:val="0"/>
+          <w:i w:val="0"/>
+          <w:color w:val="5D6A75"/>
+          <w:sz w:val="18"/>
+        </w:rPr>
+        <w:t xml:space="preserve">  |  </w:t>
+      </w:r>
+      <w:hyperlink r:id="rId19">
+        <w:r>
+          <w:rPr>
+            <w:rFonts w:ascii="Calibri" w:hAnsi="Calibri"/>
+            <w:color w:val="087E8B"/>
+            <w:sz w:val="18"/>
+            <w:b/>
+            <w:u w:val="none"/>
+          </w:rPr>
+          <w:t>englishroad.com</w:t>
+        </w:r>
+      </w:hyperlink>
+    </w:p>
+    <w:p>
+      <w:pPr>
+        <w:pStyle w:val="CVSummary"/>
+        <w:keepLines/>
+        <w:tabs>
+          <w:tab w:pos="2520" w:val="left"/>
+        </w:tabs>
+        <w:spacing w:before="0" w:after="20" w:line="240" w:lineRule="auto"/>
+      </w:pPr>
+      <w:r>
+        <w:rPr>
+          <w:rFonts w:ascii="Calibri" w:hAnsi="Calibri" w:eastAsia="Calibri"/>
+          <w:b/>
+          <w:i w:val="0"/>
+          <w:color w:val="17324D"/>
+          <w:sz w:val="18"/>
+        </w:rPr>
+        <w:t>Critical thinking</w:t>
+      </w:r>
+      <w:r>
+        <w:rPr>
+          <w:rFonts w:ascii="Calibri" w:hAnsi="Calibri" w:eastAsia="Calibri"/>
+          <w:b w:val="0"/>
+          <w:i w:val="0"/>
+          <w:color w:val="5D6A75"/>
+          <w:sz w:val="18"/>
+        </w:rPr>
+        <w:tab/>
+      </w:r>
+      <w:hyperlink r:id="rId20">
+        <w:r>
+          <w:rPr>
+            <w:rFonts w:ascii="Calibri" w:hAnsi="Calibri"/>
+            <w:color w:val="087E8B"/>
+            <w:sz w:val="18"/>
+            <w:b/>
+            <w:u w:val="none"/>
+          </w:rPr>
+          <w:t>xixteen.com</w:t>
+        </w:r>
+      </w:hyperlink>
+      <w:r>
+        <w:rPr>
+          <w:rFonts w:ascii="Calibri" w:hAnsi="Calibri" w:eastAsia="Calibri"/>
+          <w:b w:val="0"/>
+          <w:i w:val="0"/>
+          <w:color w:val="5D6A75"/>
+          <w:sz w:val="18"/>
+        </w:rPr>
+        <w:t xml:space="preserve">  |  </w:t>
+      </w:r>
+      <w:hyperlink r:id="rId21">
+        <w:r>
+          <w:rPr>
+            <w:rFonts w:ascii="Calibri" w:hAnsi="Calibri"/>
+            <w:color w:val="087E8B"/>
+            <w:sz w:val="18"/>
+            <w:b/>
+            <w:u w:val="none"/>
+          </w:rPr>
+          <w:t>logfall.com</w:t>
+        </w:r>
+      </w:hyperlink>
+      <w:r>
+        <w:rPr>
+          <w:rFonts w:ascii="Calibri" w:hAnsi="Calibri" w:eastAsia="Calibri"/>
+          <w:b w:val="0"/>
+          <w:i w:val="0"/>
+          <w:color w:val="5D6A75"/>
+          <w:sz w:val="18"/>
+        </w:rPr>
+        <w:t xml:space="preserve">  |  </w:t>
+      </w:r>
+      <w:hyperlink r:id="rId22">
+        <w:r>
+          <w:rPr>
+            <w:rFonts w:ascii="Calibri" w:hAnsi="Calibri"/>
+            <w:color w:val="087E8B"/>
+            <w:sz w:val="18"/>
+            <w:b/>
+            <w:u w:val="none"/>
+          </w:rPr>
+          <w:t>cogbias.site</w:t>
+        </w:r>
+      </w:hyperlink>
+    </w:p>
+    <w:p>
+      <w:pPr>
+        <w:pStyle w:val="CVSummary"/>
+        <w:keepLines/>
+        <w:tabs>
+          <w:tab w:pos="2520" w:val="left"/>
+        </w:tabs>
+        <w:spacing w:before="0" w:after="20" w:line="240" w:lineRule="auto"/>
+      </w:pPr>
+      <w:r>
+        <w:rPr>
+          <w:rFonts w:ascii="Calibri" w:hAnsi="Calibri" w:eastAsia="Calibri"/>
+          <w:b/>
+          <w:i w:val="0"/>
+          <w:color w:val="17324D"/>
+          <w:sz w:val="18"/>
+        </w:rPr>
+        <w:t>Academic / philosophy</w:t>
+      </w:r>
+      <w:r>
+        <w:rPr>
+          <w:rFonts w:ascii="Calibri" w:hAnsi="Calibri" w:eastAsia="Calibri"/>
+          <w:b w:val="0"/>
+          <w:i w:val="0"/>
+          <w:color w:val="5D6A75"/>
+          <w:sz w:val="18"/>
+        </w:rPr>
+        <w:tab/>
+      </w:r>
+      <w:hyperlink r:id="rId23">
+        <w:r>
+          <w:rPr>
+            <w:rFonts w:ascii="Calibri" w:hAnsi="Calibri"/>
+            <w:color w:val="087E8B"/>
+            <w:sz w:val="18"/>
+            <w:b/>
+            <w:u w:val="none"/>
+          </w:rPr>
+          <w:t>credencing.com</w:t>
+        </w:r>
+      </w:hyperlink>
+      <w:r>
+        <w:rPr>
+          <w:rFonts w:ascii="Calibri" w:hAnsi="Calibri" w:eastAsia="Calibri"/>
+          <w:b w:val="0"/>
+          <w:i w:val="0"/>
+          <w:color w:val="5D6A75"/>
+          <w:sz w:val="18"/>
+        </w:rPr>
+        <w:t xml:space="preserve">  |  </w:t>
+      </w:r>
+      <w:hyperlink r:id="rId24">
+        <w:r>
+          <w:rPr>
+            <w:rFonts w:ascii="Calibri" w:hAnsi="Calibri"/>
+            <w:color w:val="087E8B"/>
+            <w:sz w:val="18"/>
+            <w:b/>
+            <w:u w:val="none"/>
+          </w:rPr>
+          <w:t>byteseismic.com</w:t>
+        </w:r>
+      </w:hyperlink>
+    </w:p>
+    <w:p>
+      <w:pPr>
+        <w:pStyle w:val="CVSummary"/>
+        <w:keepLines/>
+        <w:tabs>
+          <w:tab w:pos="2520" w:val="left"/>
+        </w:tabs>
+        <w:spacing w:before="0" w:after="20" w:line="240" w:lineRule="auto"/>
+      </w:pPr>
+      <w:r>
+        <w:rPr>
+          <w:rFonts w:ascii="Calibri" w:hAnsi="Calibri" w:eastAsia="Calibri"/>
+          <w:b/>
+          <w:i w:val="0"/>
+          <w:color w:val="17324D"/>
+          <w:sz w:val="18"/>
+        </w:rPr>
+        <w:t>AI production examples</w:t>
+      </w:r>
+      <w:r>
+        <w:rPr>
+          <w:rFonts w:ascii="Calibri" w:hAnsi="Calibri" w:eastAsia="Calibri"/>
+          <w:b w:val="0"/>
+          <w:i w:val="0"/>
+          <w:color w:val="5D6A75"/>
+          <w:sz w:val="18"/>
+        </w:rPr>
+        <w:tab/>
+      </w:r>
+      <w:hyperlink r:id="rId25">
+        <w:r>
+          <w:rPr>
+            <w:rFonts w:ascii="Calibri" w:hAnsi="Calibri"/>
+            <w:color w:val="087E8B"/>
+            <w:sz w:val="18"/>
+            <w:b/>
+            <w:u w:val="none"/>
+          </w:rPr>
+          <w:t>paperclipalypse.com</w:t>
+        </w:r>
+      </w:hyperlink>
+      <w:r>
+        <w:rPr>
+          <w:rFonts w:ascii="Calibri" w:hAnsi="Calibri" w:eastAsia="Calibri"/>
+          <w:b w:val="0"/>
+          <w:i w:val="0"/>
+          <w:color w:val="5D6A75"/>
+          <w:sz w:val="18"/>
+        </w:rPr>
+        <w:t xml:space="preserve">  |  </w:t>
+      </w:r>
+      <w:hyperlink r:id="rId26">
+        <w:r>
+          <w:rPr>
+            <w:rFonts w:ascii="Calibri" w:hAnsi="Calibri"/>
+            <w:color w:val="087E8B"/>
+            <w:sz w:val="18"/>
+            <w:b/>
+            <w:u w:val="none"/>
+          </w:rPr>
+          <w:t>onreason.com</w:t>
+        </w:r>
+      </w:hyperlink>
+      <w:r>
+        <w:rPr>
+          <w:rFonts w:ascii="Calibri" w:hAnsi="Calibri" w:eastAsia="Calibri"/>
+          <w:b w:val="0"/>
+          <w:i w:val="0"/>
+          <w:color w:val="5D6A75"/>
+          <w:sz w:val="18"/>
+        </w:rPr>
+        <w:t xml:space="preserve">  |  </w:t>
+      </w:r>
+      <w:hyperlink r:id="rId27">
+        <w:r>
+          <w:rPr>
+            <w:rFonts w:ascii="Calibri" w:hAnsi="Calibri"/>
+            <w:color w:val="087E8B"/>
+            <w:sz w:val="18"/>
+            <w:b/>
+            <w:u w:val="none"/>
+          </w:rPr>
+          <w:t>slugfester.com</w:t>
+        </w:r>
+      </w:hyperlink>
+    </w:p>
+    <w:p>
+      <w:pPr>
+        <w:pStyle w:val="Heading1CV"/>
+        <w:pBdr>
+          <w:bottom w:val="single" w:sz="8" w:space="3" w:color="B7CFD2"/>
+        </w:pBdr>
       </w:pPr>
       <w:r>
         <w:rPr>

</xml_diff>

<commit_message>
Make CV URLs print-visible
</commit_message>
<xml_diff>
--- a/output/docx/Phil_Stilwell_Modern_CV.docx
+++ b/output/docx/Phil_Stilwell_Modern_CV.docx
@@ -72,7 +72,7 @@
           <w:color w:val="5D6A75"/>
           <w:sz w:val="19"/>
         </w:rPr>
-        <w:t xml:space="preserve">  |  Seattle, Washington</w:t>
+        <w:t xml:space="preserve">  |  New Hampshire, USA</w:t>
       </w:r>
     </w:p>
     <w:p>
@@ -143,7 +143,7 @@
           <w:color w:val="087E8B"/>
           <w:sz w:val="20"/>
         </w:rPr>
-        <w:t>Contract Rewriter / Graduate School Preparation</w:t>
+        <w:t>Contract Rewriter / Graduate School Preparation / Private Language Coach</w:t>
       </w:r>
     </w:p>
     <w:p>
@@ -1294,14 +1294,15 @@
         <w:keepLines/>
         <w:tabs>
           <w:tab w:pos="2520" w:val="left"/>
+          <w:tab w:pos="2520" w:val="left"/>
         </w:tabs>
         <w:spacing w:before="0" w:after="20" w:line="240" w:lineRule="auto"/>
+        <w:ind w:left="2520" w:hanging="2520"/>
       </w:pPr>
       <w:r>
         <w:rPr>
           <w:rFonts w:ascii="Calibri" w:hAnsi="Calibri" w:eastAsia="Calibri"/>
           <w:b/>
-          <w:i w:val="0"/>
           <w:color w:val="17324D"/>
           <w:sz w:val="18"/>
         </w:rPr>
@@ -1311,9 +1312,8 @@
         <w:rPr>
           <w:rFonts w:ascii="Calibri" w:hAnsi="Calibri" w:eastAsia="Calibri"/>
           <w:b w:val="0"/>
-          <w:i w:val="0"/>
           <w:color w:val="5D6A75"/>
-          <w:sz w:val="18"/>
+          <w:sz w:val="17"/>
         </w:rPr>
         <w:tab/>
       </w:r>
@@ -1322,20 +1322,19 @@
           <w:rPr>
             <w:rFonts w:ascii="Calibri" w:hAnsi="Calibri"/>
             <w:color w:val="087E8B"/>
-            <w:sz w:val="18"/>
+            <w:sz w:val="17"/>
             <w:b/>
             <w:u w:val="none"/>
           </w:rPr>
-          <w:t>Academia.edu profile</w:t>
+          <w:t>https://suj.academia.edu/PhilStilwell</w:t>
         </w:r>
       </w:hyperlink>
       <w:r>
         <w:rPr>
           <w:rFonts w:ascii="Calibri" w:hAnsi="Calibri" w:eastAsia="Calibri"/>
           <w:b w:val="0"/>
-          <w:i w:val="0"/>
           <w:color w:val="5D6A75"/>
-          <w:sz w:val="18"/>
+          <w:sz w:val="17"/>
         </w:rPr>
         <w:t xml:space="preserve">  |  </w:t>
       </w:r>
@@ -1344,11 +1343,11 @@
           <w:rPr>
             <w:rFonts w:ascii="Calibri" w:hAnsi="Calibri"/>
             <w:color w:val="087E8B"/>
-            <w:sz w:val="18"/>
+            <w:sz w:val="17"/>
             <w:b/>
             <w:u w:val="none"/>
           </w:rPr>
-          <w:t>PhilPeople profile</w:t>
+          <w:t>https://philpeople.org/profiles/phil-stilwell-1</w:t>
         </w:r>
       </w:hyperlink>
     </w:p>
@@ -1358,14 +1357,15 @@
         <w:keepLines/>
         <w:tabs>
           <w:tab w:pos="2520" w:val="left"/>
+          <w:tab w:pos="2520" w:val="left"/>
         </w:tabs>
         <w:spacing w:before="0" w:after="20" w:line="240" w:lineRule="auto"/>
+        <w:ind w:left="2520" w:hanging="2520"/>
       </w:pPr>
       <w:r>
         <w:rPr>
           <w:rFonts w:ascii="Calibri" w:hAnsi="Calibri" w:eastAsia="Calibri"/>
           <w:b/>
-          <w:i w:val="0"/>
           <w:color w:val="17324D"/>
           <w:sz w:val="18"/>
         </w:rPr>
@@ -1375,9 +1375,8 @@
         <w:rPr>
           <w:rFonts w:ascii="Calibri" w:hAnsi="Calibri" w:eastAsia="Calibri"/>
           <w:b w:val="0"/>
-          <w:i w:val="0"/>
           <w:color w:val="5D6A75"/>
-          <w:sz w:val="18"/>
+          <w:sz w:val="17"/>
         </w:rPr>
         <w:tab/>
       </w:r>
@@ -1386,20 +1385,19 @@
           <w:rPr>
             <w:rFonts w:ascii="Calibri" w:hAnsi="Calibri"/>
             <w:color w:val="087E8B"/>
-            <w:sz w:val="18"/>
+            <w:sz w:val="17"/>
             <w:b/>
             <w:u w:val="none"/>
           </w:rPr>
-          <w:t>englishladder.com</w:t>
+          <w:t>https://englishladder.com</w:t>
         </w:r>
       </w:hyperlink>
       <w:r>
         <w:rPr>
           <w:rFonts w:ascii="Calibri" w:hAnsi="Calibri" w:eastAsia="Calibri"/>
           <w:b w:val="0"/>
-          <w:i w:val="0"/>
           <w:color w:val="5D6A75"/>
-          <w:sz w:val="18"/>
+          <w:sz w:val="17"/>
         </w:rPr>
         <w:t xml:space="preserve">  |  </w:t>
       </w:r>
@@ -1408,11 +1406,11 @@
           <w:rPr>
             <w:rFonts w:ascii="Calibri" w:hAnsi="Calibri"/>
             <w:color w:val="087E8B"/>
-            <w:sz w:val="18"/>
+            <w:sz w:val="17"/>
             <w:b/>
             <w:u w:val="none"/>
           </w:rPr>
-          <w:t>englishroad.com</w:t>
+          <w:t>https://englishroad.com</w:t>
         </w:r>
       </w:hyperlink>
     </w:p>
@@ -1422,14 +1420,15 @@
         <w:keepLines/>
         <w:tabs>
           <w:tab w:pos="2520" w:val="left"/>
+          <w:tab w:pos="2520" w:val="left"/>
         </w:tabs>
         <w:spacing w:before="0" w:after="20" w:line="240" w:lineRule="auto"/>
+        <w:ind w:left="2520" w:hanging="2520"/>
       </w:pPr>
       <w:r>
         <w:rPr>
           <w:rFonts w:ascii="Calibri" w:hAnsi="Calibri" w:eastAsia="Calibri"/>
           <w:b/>
-          <w:i w:val="0"/>
           <w:color w:val="17324D"/>
           <w:sz w:val="18"/>
         </w:rPr>
@@ -1439,9 +1438,8 @@
         <w:rPr>
           <w:rFonts w:ascii="Calibri" w:hAnsi="Calibri" w:eastAsia="Calibri"/>
           <w:b w:val="0"/>
-          <w:i w:val="0"/>
           <w:color w:val="5D6A75"/>
-          <w:sz w:val="18"/>
+          <w:sz w:val="17"/>
         </w:rPr>
         <w:tab/>
       </w:r>
@@ -1450,20 +1448,19 @@
           <w:rPr>
             <w:rFonts w:ascii="Calibri" w:hAnsi="Calibri"/>
             <w:color w:val="087E8B"/>
-            <w:sz w:val="18"/>
+            <w:sz w:val="17"/>
             <w:b/>
             <w:u w:val="none"/>
           </w:rPr>
-          <w:t>xixteen.com</w:t>
+          <w:t>https://xixteen.com</w:t>
         </w:r>
       </w:hyperlink>
       <w:r>
         <w:rPr>
           <w:rFonts w:ascii="Calibri" w:hAnsi="Calibri" w:eastAsia="Calibri"/>
           <w:b w:val="0"/>
-          <w:i w:val="0"/>
           <w:color w:val="5D6A75"/>
-          <w:sz w:val="18"/>
+          <w:sz w:val="17"/>
         </w:rPr>
         <w:t xml:space="preserve">  |  </w:t>
       </w:r>
@@ -1472,20 +1469,19 @@
           <w:rPr>
             <w:rFonts w:ascii="Calibri" w:hAnsi="Calibri"/>
             <w:color w:val="087E8B"/>
-            <w:sz w:val="18"/>
+            <w:sz w:val="17"/>
             <w:b/>
             <w:u w:val="none"/>
           </w:rPr>
-          <w:t>logfall.com</w:t>
+          <w:t>https://logfall.com</w:t>
         </w:r>
       </w:hyperlink>
       <w:r>
         <w:rPr>
           <w:rFonts w:ascii="Calibri" w:hAnsi="Calibri" w:eastAsia="Calibri"/>
           <w:b w:val="0"/>
-          <w:i w:val="0"/>
           <w:color w:val="5D6A75"/>
-          <w:sz w:val="18"/>
+          <w:sz w:val="17"/>
         </w:rPr>
         <w:t xml:space="preserve">  |  </w:t>
       </w:r>
@@ -1494,11 +1490,11 @@
           <w:rPr>
             <w:rFonts w:ascii="Calibri" w:hAnsi="Calibri"/>
             <w:color w:val="087E8B"/>
-            <w:sz w:val="18"/>
+            <w:sz w:val="17"/>
             <w:b/>
             <w:u w:val="none"/>
           </w:rPr>
-          <w:t>cogbias.site</w:t>
+          <w:t>https://cogbias.site</w:t>
         </w:r>
       </w:hyperlink>
     </w:p>
@@ -1508,14 +1504,15 @@
         <w:keepLines/>
         <w:tabs>
           <w:tab w:pos="2520" w:val="left"/>
+          <w:tab w:pos="2520" w:val="left"/>
         </w:tabs>
         <w:spacing w:before="0" w:after="20" w:line="240" w:lineRule="auto"/>
+        <w:ind w:left="2520" w:hanging="2520"/>
       </w:pPr>
       <w:r>
         <w:rPr>
           <w:rFonts w:ascii="Calibri" w:hAnsi="Calibri" w:eastAsia="Calibri"/>
           <w:b/>
-          <w:i w:val="0"/>
           <w:color w:val="17324D"/>
           <w:sz w:val="18"/>
         </w:rPr>
@@ -1525,9 +1522,8 @@
         <w:rPr>
           <w:rFonts w:ascii="Calibri" w:hAnsi="Calibri" w:eastAsia="Calibri"/>
           <w:b w:val="0"/>
-          <w:i w:val="0"/>
           <w:color w:val="5D6A75"/>
-          <w:sz w:val="18"/>
+          <w:sz w:val="17"/>
         </w:rPr>
         <w:tab/>
       </w:r>
@@ -1536,20 +1532,19 @@
           <w:rPr>
             <w:rFonts w:ascii="Calibri" w:hAnsi="Calibri"/>
             <w:color w:val="087E8B"/>
-            <w:sz w:val="18"/>
+            <w:sz w:val="17"/>
             <w:b/>
             <w:u w:val="none"/>
           </w:rPr>
-          <w:t>credencing.com</w:t>
+          <w:t>https://credencing.com</w:t>
         </w:r>
       </w:hyperlink>
       <w:r>
         <w:rPr>
           <w:rFonts w:ascii="Calibri" w:hAnsi="Calibri" w:eastAsia="Calibri"/>
           <w:b w:val="0"/>
-          <w:i w:val="0"/>
           <w:color w:val="5D6A75"/>
-          <w:sz w:val="18"/>
+          <w:sz w:val="17"/>
         </w:rPr>
         <w:t xml:space="preserve">  |  </w:t>
       </w:r>
@@ -1558,11 +1553,11 @@
           <w:rPr>
             <w:rFonts w:ascii="Calibri" w:hAnsi="Calibri"/>
             <w:color w:val="087E8B"/>
-            <w:sz w:val="18"/>
+            <w:sz w:val="17"/>
             <w:b/>
             <w:u w:val="none"/>
           </w:rPr>
-          <w:t>byteseismic.com</w:t>
+          <w:t>https://byteseismic.com</w:t>
         </w:r>
       </w:hyperlink>
     </w:p>
@@ -1572,14 +1567,15 @@
         <w:keepLines/>
         <w:tabs>
           <w:tab w:pos="2520" w:val="left"/>
+          <w:tab w:pos="2520" w:val="left"/>
         </w:tabs>
         <w:spacing w:before="0" w:after="20" w:line="240" w:lineRule="auto"/>
+        <w:ind w:left="2520" w:hanging="2520"/>
       </w:pPr>
       <w:r>
         <w:rPr>
           <w:rFonts w:ascii="Calibri" w:hAnsi="Calibri" w:eastAsia="Calibri"/>
           <w:b/>
-          <w:i w:val="0"/>
           <w:color w:val="17324D"/>
           <w:sz w:val="18"/>
         </w:rPr>
@@ -1589,9 +1585,8 @@
         <w:rPr>
           <w:rFonts w:ascii="Calibri" w:hAnsi="Calibri" w:eastAsia="Calibri"/>
           <w:b w:val="0"/>
-          <w:i w:val="0"/>
           <w:color w:val="5D6A75"/>
-          <w:sz w:val="18"/>
+          <w:sz w:val="17"/>
         </w:rPr>
         <w:tab/>
       </w:r>
@@ -1600,20 +1595,19 @@
           <w:rPr>
             <w:rFonts w:ascii="Calibri" w:hAnsi="Calibri"/>
             <w:color w:val="087E8B"/>
-            <w:sz w:val="18"/>
+            <w:sz w:val="17"/>
             <w:b/>
             <w:u w:val="none"/>
           </w:rPr>
-          <w:t>paperclipalypse.com</w:t>
+          <w:t>https://paperclipalypse.com</w:t>
         </w:r>
       </w:hyperlink>
       <w:r>
         <w:rPr>
           <w:rFonts w:ascii="Calibri" w:hAnsi="Calibri" w:eastAsia="Calibri"/>
           <w:b w:val="0"/>
-          <w:i w:val="0"/>
           <w:color w:val="5D6A75"/>
-          <w:sz w:val="18"/>
+          <w:sz w:val="17"/>
         </w:rPr>
         <w:t xml:space="preserve">  |  </w:t>
       </w:r>
@@ -1622,20 +1616,19 @@
           <w:rPr>
             <w:rFonts w:ascii="Calibri" w:hAnsi="Calibri"/>
             <w:color w:val="087E8B"/>
-            <w:sz w:val="18"/>
+            <w:sz w:val="17"/>
             <w:b/>
             <w:u w:val="none"/>
           </w:rPr>
-          <w:t>onreason.com</w:t>
+          <w:t>https://onreason.com</w:t>
         </w:r>
       </w:hyperlink>
       <w:r>
         <w:rPr>
           <w:rFonts w:ascii="Calibri" w:hAnsi="Calibri" w:eastAsia="Calibri"/>
           <w:b w:val="0"/>
-          <w:i w:val="0"/>
           <w:color w:val="5D6A75"/>
-          <w:sz w:val="18"/>
+          <w:sz w:val="17"/>
         </w:rPr>
         <w:t xml:space="preserve">  |  </w:t>
       </w:r>
@@ -1644,11 +1637,11 @@
           <w:rPr>
             <w:rFonts w:ascii="Calibri" w:hAnsi="Calibri"/>
             <w:color w:val="087E8B"/>
-            <w:sz w:val="18"/>
+            <w:sz w:val="17"/>
             <w:b/>
             <w:u w:val="none"/>
           </w:rPr>
-          <w:t>slugfester.com</w:t>
+          <w:t>https://slugfester.com</w:t>
         </w:r>
       </w:hyperlink>
     </w:p>
@@ -1755,6 +1748,7 @@
     </w:p>
     <w:sectPr>
       <w:footerReference w:type="default" r:id="rId9"/>
+      <w:headerReference w:type="default" r:id="rId28"/>
       <w:pgSz w:w="12240" w:h="15840"/>
       <w:pgMar w:top="1440" w:right="1440" w:bottom="1440" w:left="1440" w:header="708" w:footer="708" w:gutter="0"/>
       <w:cols w:space="720"/>
@@ -1803,6 +1797,16 @@
     </w:r>
   </w:p>
 </w:ftr>
+</file>
+
+<file path=word/header1.xml><?xml version="1.0" encoding="utf-8"?>
+<w:hdr xmlns:m="http://schemas.openxmlformats.org/officeDocument/2006/math" xmlns:mc="http://schemas.openxmlformats.org/markup-compatibility/2006" xmlns:mo="http://schemas.microsoft.com/office/mac/office/2008/main" xmlns:mv="urn:schemas-microsoft-com:mac:vml" xmlns:o="urn:schemas-microsoft-com:office:office" xmlns:r="http://schemas.openxmlformats.org/officeDocument/2006/relationships" xmlns:v="urn:schemas-microsoft-com:vml" xmlns:w10="urn:schemas-microsoft-com:office:word" xmlns:w14="http://schemas.microsoft.com/office/word/2010/wordml" xmlns:w="http://schemas.openxmlformats.org/wordprocessingml/2006/main" xmlns:wne="http://schemas.microsoft.com/office/word/2006/wordml" xmlns:wp14="http://schemas.microsoft.com/office/word/2010/wordprocessingDrawing" xmlns:wp="http://schemas.openxmlformats.org/drawingml/2006/wordprocessingDrawing" xmlns:wpc="http://schemas.microsoft.com/office/word/2010/wordprocessingCanvas" xmlns:wpg="http://schemas.microsoft.com/office/word/2010/wordprocessingGroup" xmlns:wpi="http://schemas.microsoft.com/office/word/2010/wordprocessingInk" xmlns:wps="http://schemas.microsoft.com/office/word/2010/wordprocessingShape" mc:Ignorable="w14 wp14">
+  <w:p>
+    <w:pPr>
+      <w:pStyle w:val="Header"/>
+    </w:pPr>
+  </w:p>
+</w:hdr>
 </file>
 
 <file path=word/numbering.xml><?xml version="1.0" encoding="utf-8"?>

</xml_diff>

<commit_message>
Trim CV independent projects section
</commit_message>
<xml_diff>
--- a/output/docx/Phil_Stilwell_Modern_CV.docx
+++ b/output/docx/Phil_Stilwell_Modern_CV.docx
@@ -1148,69 +1148,7 @@
         </w:numPr>
       </w:pPr>
       <w:r>
-        <w:rPr>
-          <w:rFonts w:ascii="Calibri" w:hAnsi="Calibri" w:eastAsia="Calibri"/>
-          <w:color w:val="243447"/>
-          <w:sz w:val="20"/>
-        </w:rPr>
-        <w:t xml:space="preserve">Created instructional tools and resources through </w:t>
-      </w:r>
-      <w:hyperlink r:id="rId12">
-        <w:r>
-          <w:rPr>
-            <w:rFonts w:ascii="Calibri" w:hAnsi="Calibri"/>
-            <w:color w:val="087E8B"/>
-            <w:sz w:val="20"/>
-            <w:b/>
-            <w:u w:val="none"/>
-          </w:rPr>
-          <w:t>NimbleEd</w:t>
-        </w:r>
-      </w:hyperlink>
-      <w:r>
-        <w:rPr>
-          <w:rFonts w:ascii="Calibri" w:hAnsi="Calibri" w:eastAsia="Calibri"/>
-          <w:color w:val="243447"/>
-          <w:sz w:val="20"/>
-        </w:rPr>
-        <w:t>.</w:t>
-      </w:r>
-    </w:p>
-    <w:p>
-      <w:pPr>
-        <w:pStyle w:val="CVBullet"/>
-        <w:numPr>
-          <w:ilvl w:val="0"/>
-          <w:numId w:val="10"/>
-        </w:numPr>
-      </w:pPr>
-      <w:r>
-        <w:rPr>
-          <w:rFonts w:ascii="Calibri" w:hAnsi="Calibri" w:eastAsia="Calibri"/>
-          <w:color w:val="243447"/>
-          <w:sz w:val="20"/>
-        </w:rPr>
-        <w:t xml:space="preserve">Administers the </w:t>
-      </w:r>
-      <w:hyperlink r:id="rId13">
-        <w:r>
-          <w:rPr>
-            <w:rFonts w:ascii="Calibri" w:hAnsi="Calibri"/>
-            <w:color w:val="087E8B"/>
-            <w:sz w:val="20"/>
-            <w:b/>
-            <w:u w:val="none"/>
-          </w:rPr>
-          <w:t>Christian Thought Survey</w:t>
-        </w:r>
-      </w:hyperlink>
-      <w:r>
-        <w:rPr>
-          <w:rFonts w:ascii="Calibri" w:hAnsi="Calibri" w:eastAsia="Calibri"/>
-          <w:color w:val="243447"/>
-          <w:sz w:val="20"/>
-        </w:rPr>
-        <w:t>, a personal data-analysis project.</w:t>
+        <w:t>Created instructional tools and resources.</w:t>
       </w:r>
     </w:p>
     <w:p>

</xml_diff>

<commit_message>
Refine CV corporate training impact
</commit_message>
<xml_diff>
--- a/output/docx/Phil_Stilwell_Modern_CV.docx
+++ b/output/docx/Phil_Stilwell_Modern_CV.docx
@@ -1114,12 +1114,7 @@
         </w:numPr>
       </w:pPr>
       <w:r>
-        <w:rPr>
-          <w:rFonts w:ascii="Calibri" w:hAnsi="Calibri" w:eastAsia="Calibri"/>
-          <w:color w:val="243447"/>
-          <w:sz w:val="20"/>
-        </w:rPr>
-        <w:t>Delivered customized business-English training at more than 100 corporations.</w:t>
+        <w:t>Delivered customized business-English training at 100+ corporations across dozens of industries.</w:t>
       </w:r>
     </w:p>
     <w:p>

</xml_diff>

<commit_message>
Polish CV language throughout
</commit_message>
<xml_diff>
--- a/output/docx/Phil_Stilwell_Modern_CV.docx
+++ b/output/docx/Phil_Stilwell_Modern_CV.docx
@@ -80,12 +80,7 @@
         <w:pStyle w:val="CVSummary"/>
       </w:pPr>
       <w:r>
-        <w:rPr>
-          <w:rFonts w:ascii="Calibri" w:hAnsi="Calibri" w:eastAsia="Calibri"/>
-          <w:color w:val="243447"/>
-          <w:sz w:val="21"/>
-        </w:rPr>
-        <w:t>Educator, curriculum designer, and academic writing specialist with more than 25 years of experience across universities, corporations, and government in Japan. Expertise spans graduate-school preparation, technical and academic rewriting, English-medium content instruction, corporate training, and technology-supported learning.</w:t>
+        <w:t>Educator, curriculum designer, and academic and technical writing specialist with 25+ years of experience across universities, corporations, and government institutions in Japan. Expertise includes graduate-school preparation, academic and technical rewriting, English-medium instruction, corporate training, and technology-enhanced learning.</w:t>
       </w:r>
     </w:p>
     <w:p>
@@ -155,12 +150,7 @@
         </w:numPr>
       </w:pPr>
       <w:r>
-        <w:rPr>
-          <w:rFonts w:ascii="Calibri" w:hAnsi="Calibri" w:eastAsia="Calibri"/>
-          <w:color w:val="243447"/>
-          <w:sz w:val="20"/>
-        </w:rPr>
-        <w:t>Rewrite technical papers for professors and graduate students at universities in Japan.</w:t>
+        <w:t>Rewrite technical and academic papers for professors and graduate students at Japanese universities.</w:t>
       </w:r>
     </w:p>
     <w:p>
@@ -172,12 +162,7 @@
         </w:numPr>
       </w:pPr>
       <w:r>
-        <w:rPr>
-          <w:rFonts w:ascii="Calibri" w:hAnsi="Calibri" w:eastAsia="Calibri"/>
-          <w:color w:val="243447"/>
-          <w:sz w:val="20"/>
-        </w:rPr>
-        <w:t>Coach students in writing, submission, and presentation for academic work at MIT, Stanford, and programs in Silicon Valley.</w:t>
+        <w:t>Coach students in writing, submitting, and presenting academic work for programs at MIT, Stanford, and in Silicon Valley.</w:t>
       </w:r>
     </w:p>
     <w:p>
@@ -189,12 +174,7 @@
         </w:numPr>
       </w:pPr>
       <w:r>
-        <w:rPr>
-          <w:rFonts w:ascii="Calibri" w:hAnsi="Calibri" w:eastAsia="Calibri"/>
-          <w:color w:val="243447"/>
-          <w:sz w:val="20"/>
-        </w:rPr>
-        <w:t>Prepare students entering overseas MBA and graduate programs; deliver corporate English training and private Zoom instruction in English and core business concepts.</w:t>
+        <w:t>Prepare students for overseas MBA and graduate programs; provide corporate English training and private Zoom-based instruction in English and core business concepts.</w:t>
       </w:r>
     </w:p>
     <w:p>
@@ -206,12 +186,7 @@
         </w:numPr>
       </w:pPr>
       <w:r>
-        <w:rPr>
-          <w:rFonts w:ascii="Calibri" w:hAnsi="Calibri" w:eastAsia="Calibri"/>
-          <w:color w:val="243447"/>
-          <w:sz w:val="20"/>
-        </w:rPr>
-        <w:t>Teach practical AI technologies and provide individualized life coaching alongside academic and professional-development services.</w:t>
+        <w:t>Teach practical applications of AI and provide individualized life coaching alongside academic and professional-development services.</w:t>
       </w:r>
     </w:p>
     <w:p>
@@ -260,12 +235,7 @@
         <w:pStyle w:val="ExperienceBody"/>
       </w:pPr>
       <w:r>
-        <w:rPr>
-          <w:rFonts w:ascii="Calibri" w:hAnsi="Calibri" w:eastAsia="Calibri"/>
-          <w:color w:val="243447"/>
-          <w:sz w:val="20"/>
-        </w:rPr>
-        <w:t>Led five one-hour sessions each week to prepare participants for global leadership roles.</w:t>
+        <w:t>Led five one-hour sessions per week to prepare participants for global leadership roles.</w:t>
       </w:r>
     </w:p>
     <w:p>
@@ -314,12 +284,7 @@
         <w:pStyle w:val="ExperienceBody"/>
       </w:pPr>
       <w:r>
-        <w:rPr>
-          <w:rFonts w:ascii="Calibri" w:hAnsi="Calibri" w:eastAsia="Calibri"/>
-          <w:color w:val="243447"/>
-          <w:sz w:val="20"/>
-        </w:rPr>
-        <w:t>Taught three twice-weekly, English-medium content courses in the Business Administration department.</w:t>
+        <w:t>Delivered three twice-weekly, English-medium courses in the Business Administration department.</w:t>
       </w:r>
     </w:p>
     <w:p>
@@ -368,12 +333,7 @@
         <w:pStyle w:val="ExperienceBody"/>
       </w:pPr>
       <w:r>
-        <w:rPr>
-          <w:rFonts w:ascii="Calibri" w:hAnsi="Calibri" w:eastAsia="Calibri"/>
-          <w:color w:val="243447"/>
-          <w:sz w:val="20"/>
-        </w:rPr>
-        <w:t>Taught academic writing, critical thinking, English grammar, and other courses. Delivered customized instruction at universities, Japanese government offices, and corporations.</w:t>
+        <w:t>Taught academic writing, critical thinking, grammar, and related subjects; delivered customized instruction for universities, Japanese government offices, and corporations.</w:t>
       </w:r>
     </w:p>
     <w:p>
@@ -422,12 +382,7 @@
         <w:pStyle w:val="ExperienceBody"/>
       </w:pPr>
       <w:r>
-        <w:rPr>
-          <w:rFonts w:ascii="Calibri" w:hAnsi="Calibri" w:eastAsia="Calibri"/>
-          <w:color w:val="243447"/>
-          <w:sz w:val="20"/>
-        </w:rPr>
-        <w:t>Taught critical thinking, negotiation, grammar, vocabulary development, and TOEFL preparation to students in academia and industry.</w:t>
+        <w:t>Taught critical thinking, negotiation, grammar, vocabulary development, and TOEFL preparation to learners in academia and industry.</w:t>
       </w:r>
     </w:p>
     <w:p>
@@ -501,12 +456,7 @@
         <w:pStyle w:val="ExperienceBody"/>
       </w:pPr>
       <w:r>
-        <w:rPr>
-          <w:rFonts w:ascii="Calibri" w:hAnsi="Calibri" w:eastAsia="Calibri"/>
-          <w:color w:val="243447"/>
-          <w:sz w:val="20"/>
-        </w:rPr>
-        <w:t>Taught an annual 10-week technical writing course for international graduate students, covering style guides, composition, and best practices.</w:t>
+        <w:t>Taught an annual 10-week technical writing course for international graduate students, covering style guides, composition, and effective writing practices.</w:t>
       </w:r>
     </w:p>
     <w:p>
@@ -555,12 +505,7 @@
         <w:pStyle w:val="ExperienceBody"/>
       </w:pPr>
       <w:r>
-        <w:rPr>
-          <w:rFonts w:ascii="Calibri" w:hAnsi="Calibri" w:eastAsia="Calibri"/>
-          <w:color w:val="243447"/>
-          <w:sz w:val="20"/>
-        </w:rPr>
-        <w:t>Taught undergraduate and graduate students macroeconomic concepts; coached students and assessed their economic term papers.</w:t>
+        <w:t>Taught macroeconomics to undergraduate and graduate students; provided coaching and evaluated their economics term papers.</w:t>
       </w:r>
     </w:p>
     <w:p>
@@ -609,12 +554,7 @@
         <w:pStyle w:val="ExperienceBody"/>
       </w:pPr>
       <w:r>
-        <w:rPr>
-          <w:rFonts w:ascii="Calibri" w:hAnsi="Calibri" w:eastAsia="Calibri"/>
-          <w:color w:val="243447"/>
-          <w:sz w:val="20"/>
-        </w:rPr>
-        <w:t>Designed and implemented an English-language acquisition curriculum for professional researchers.</w:t>
+        <w:t>Designed and implemented an English-language learning curriculum for professional researchers.</w:t>
       </w:r>
     </w:p>
     <w:p>
@@ -663,12 +603,7 @@
         <w:pStyle w:val="ExperienceBody"/>
       </w:pPr>
       <w:r>
-        <w:rPr>
-          <w:rFonts w:ascii="Calibri" w:hAnsi="Calibri" w:eastAsia="Calibri"/>
-          <w:color w:val="243447"/>
-          <w:sz w:val="20"/>
-        </w:rPr>
-        <w:t>Taught large undergraduate English classes and designed curriculum using the textbook Focus on Britain.</w:t>
+        <w:t>Taught large undergraduate English courses and designed the curriculum around the textbook Focus on Britain.</w:t>
       </w:r>
     </w:p>
     <w:p>
@@ -717,12 +652,7 @@
         <w:pStyle w:val="ExperienceBody"/>
       </w:pPr>
       <w:r>
-        <w:rPr>
-          <w:rFonts w:ascii="Calibri" w:hAnsi="Calibri" w:eastAsia="Calibri"/>
-          <w:color w:val="243447"/>
-          <w:sz w:val="20"/>
-        </w:rPr>
-        <w:t>Taught English tailored to the official responsibilities of Prime Minister Hatoyama's cabinet officers.</w:t>
+        <w:t>Delivered English instruction tailored to the official responsibilities of cabinet officers under Prime Minister Hatoyama.</w:t>
       </w:r>
     </w:p>
     <w:p>
@@ -771,12 +701,7 @@
         <w:pStyle w:val="ExperienceBody"/>
       </w:pPr>
       <w:r>
-        <w:rPr>
-          <w:rFonts w:ascii="Calibri" w:hAnsi="Calibri" w:eastAsia="Calibri"/>
-          <w:color w:val="243447"/>
-          <w:sz w:val="20"/>
-        </w:rPr>
-        <w:t>Taught business professionals at a range of corporations.</w:t>
+        <w:t>Provided business-English training to professionals across a range of corporations.</w:t>
       </w:r>
     </w:p>
     <w:p>
@@ -825,12 +750,7 @@
         <w:pStyle w:val="ExperienceBody"/>
       </w:pPr>
       <w:r>
-        <w:rPr>
-          <w:rFonts w:ascii="Calibri" w:hAnsi="Calibri" w:eastAsia="Calibri"/>
-          <w:color w:val="243447"/>
-          <w:sz w:val="20"/>
-        </w:rPr>
-        <w:t>Taught foundational English courses to students entering the hospitality sector.</w:t>
+        <w:t>Taught foundational English to students preparing for careers in hospitality.</w:t>
       </w:r>
     </w:p>
     <w:p>
@@ -965,12 +885,7 @@
         </w:numPr>
       </w:pPr>
       <w:r>
-        <w:rPr>
-          <w:rFonts w:ascii="Calibri" w:hAnsi="Calibri" w:eastAsia="Calibri"/>
-          <w:color w:val="243447"/>
-          <w:sz w:val="20"/>
-        </w:rPr>
-        <w:t>Curriculum design; English-medium content instruction; academic writing</w:t>
+        <w:t>Curriculum design; English-medium instruction; academic writing</w:t>
       </w:r>
     </w:p>
     <w:p>
@@ -982,12 +897,7 @@
         </w:numPr>
       </w:pPr>
       <w:r>
-        <w:rPr>
-          <w:rFonts w:ascii="Calibri" w:hAnsi="Calibri" w:eastAsia="Calibri"/>
-          <w:color w:val="243447"/>
-          <w:sz w:val="20"/>
-        </w:rPr>
-        <w:t>Corporate English training; global leadership development; negotiation skills</w:t>
+        <w:t>Corporate English training; global leadership development; negotiation</w:t>
       </w:r>
     </w:p>
     <w:p>
@@ -1016,12 +926,7 @@
         </w:numPr>
       </w:pPr>
       <w:r>
-        <w:rPr>
-          <w:rFonts w:ascii="Calibri" w:hAnsi="Calibri" w:eastAsia="Calibri"/>
-          <w:color w:val="243447"/>
-          <w:sz w:val="20"/>
-        </w:rPr>
-        <w:t>Instructional technology; AI prompt design; Canva; Google Drive; data analytics</w:t>
+        <w:t>Instructional technology; practical AI applications; prompt design; Canva; Google Drive; data analytics</w:t>
       </w:r>
     </w:p>
     <w:p>
@@ -1033,12 +938,7 @@
         </w:numPr>
       </w:pPr>
       <w:r>
-        <w:rPr>
-          <w:rFonts w:ascii="Calibri" w:hAnsi="Calibri" w:eastAsia="Calibri"/>
-          <w:color w:val="243447"/>
-          <w:sz w:val="20"/>
-        </w:rPr>
-        <w:t>MS Word and Excel macro design; Perl programming for a B2B application</w:t>
+        <w:t>Microsoft Word and Excel macro design; Perl programming for a B2B application</w:t>
       </w:r>
     </w:p>
     <w:p>
@@ -1114,7 +1014,7 @@
         </w:numPr>
       </w:pPr>
       <w:r>
-        <w:t>Delivered customized business-English training at 100+ corporations across dozens of industries.</w:t>
+        <w:t>Delivered customized business-English training to 100+ corporations spanning dozens of industries.</w:t>
       </w:r>
     </w:p>
     <w:p>
@@ -1126,12 +1026,7 @@
         </w:numPr>
       </w:pPr>
       <w:r>
-        <w:rPr>
-          <w:rFonts w:ascii="Calibri" w:hAnsi="Calibri" w:eastAsia="Calibri"/>
-          <w:color w:val="243447"/>
-          <w:sz w:val="20"/>
-        </w:rPr>
-        <w:t>Served for five years as a Speech &amp; Debate Judge at the national Japan Customs Bureau contest; Chief Judge, 2016 - 2017.</w:t>
+        <w:t>Served five years as a Speech &amp; Debate Judge for the national Japan Customs Bureau contest, including as Chief Judge from 2016 to 2017.</w:t>
       </w:r>
     </w:p>
     <w:p>
@@ -1143,7 +1038,7 @@
         </w:numPr>
       </w:pPr>
       <w:r>
-        <w:t>Created instructional tools and resources.</w:t>
+        <w:t>Created instructional tools and learning resources.</w:t>
       </w:r>
     </w:p>
     <w:p>
@@ -1641,12 +1536,7 @@
         <w:pStyle w:val="PublicationDetail"/>
       </w:pPr>
       <w:r>
-        <w:rPr>
-          <w:rFonts w:ascii="Calibri" w:hAnsi="Calibri" w:eastAsia="Calibri"/>
-          <w:color w:val="243447"/>
-          <w:sz w:val="20"/>
-        </w:rPr>
-        <w:t>English-instruction textbook. ISBN 978-4-88896-409-8.</w:t>
+        <w:t>English-language textbook. ISBN 978-4-88896-409-8.</w:t>
       </w:r>
     </w:p>
     <w:p>
@@ -1671,12 +1561,7 @@
         <w:pStyle w:val="CVSummary"/>
       </w:pPr>
       <w:r>
-        <w:rPr>
-          <w:rFonts w:ascii="Calibri" w:hAnsi="Calibri" w:eastAsia="Calibri"/>
-          <w:color w:val="243447"/>
-          <w:sz w:val="20"/>
-        </w:rPr>
-        <w:t>Philosophy of science  |  Epistemology, induction, and credencing  |  Critical thinking  |  Economic models  |  Cognitive science  |  Trends in Christian thought and practice  |  Cycling  |  Community event organizing</w:t>
+        <w:t>Philosophy of science  |  Epistemology, induction, and credencing  |  Critical thinking  |  Economic modeling  |  Cognitive science  |  Trends in Christian thought and practice  |  Cycling  |  Community event planning</w:t>
       </w:r>
     </w:p>
     <w:sectPr>

</xml_diff>

<commit_message>
Add agentic AI expertise to CV
</commit_message>
<xml_diff>
--- a/output/docx/Phil_Stilwell_Modern_CV.docx
+++ b/output/docx/Phil_Stilwell_Modern_CV.docx
@@ -938,6 +938,18 @@
         </w:numPr>
       </w:pPr>
       <w:r>
+        <w:t>Agentic AI workflows for building websites, developing tools, and producing instructional materials</w:t>
+      </w:r>
+    </w:p>
+    <w:p>
+      <w:pPr>
+        <w:pStyle w:val="CVBullet"/>
+        <w:numPr>
+          <w:ilvl w:val="0"/>
+          <w:numId w:val="10"/>
+        </w:numPr>
+      </w:pPr>
+      <w:r>
         <w:t>Microsoft Word and Excel macro design; Perl programming for a B2B application</w:t>
       </w:r>
     </w:p>

</xml_diff>

<commit_message>
Reposition CV around advanced AI expertise
</commit_message>
<xml_diff>
--- a/output/docx/Phil_Stilwell_Modern_CV.docx
+++ b/output/docx/Phil_Stilwell_Modern_CV.docx
@@ -21,13 +21,7 @@
         <w:pStyle w:val="CVHeadline"/>
       </w:pPr>
       <w:r>
-        <w:rPr>
-          <w:rFonts w:ascii="Calibri" w:hAnsi="Calibri" w:eastAsia="Calibri"/>
-          <w:b/>
-          <w:color w:val="087E8B"/>
-          <w:sz w:val="24"/>
-        </w:rPr>
-        <w:t>Educator  |  Curriculum Designer  |  Academic &amp; Technical Writing Specialist</w:t>
+        <w:t>Educator  |  Curriculum Designer  |  AI Prompting &amp; Agentic Workflow Specialist</w:t>
       </w:r>
     </w:p>
     <w:p>
@@ -80,7 +74,7 @@
         <w:pStyle w:val="CVSummary"/>
       </w:pPr>
       <w:r>
-        <w:t>Educator, curriculum designer, and academic and technical writing specialist with 25+ years of experience across universities, corporations, and government institutions in Japan. Expertise includes graduate-school preparation, academic and technical rewriting, English-medium instruction, corporate training, and technology-enhanced learning.</w:t>
+        <w:t>Educator, curriculum designer, and academic and technical writing specialist with 25+ years of experience across universities, corporations, and government institutions in Japan. Expert in AI prompting, use-case design, and agentic workflows for research, education, writing, website creation, tool development, and instructional materials. Applies AI to evidence search, hypothesis comparison, objection testing, traceability, calibration, and human-reviewed inquiry, alongside deep experience in graduate-school preparation, English-medium instruction, corporate training, and technology-enhanced learning.</w:t>
       </w:r>
     </w:p>
     <w:p>
@@ -186,7 +180,31 @@
         </w:numPr>
       </w:pPr>
       <w:r>
-        <w:t>Teach practical applications of AI and provide individualized life coaching alongside academic and professional-development services.</w:t>
+        <w:t>Teach and apply advanced AI prompting, use-case design, and agentic workflows for research, writing, website creation, tool development, and instructional materials.</w:t>
+      </w:r>
+    </w:p>
+    <w:p>
+      <w:pPr>
+        <w:pStyle w:val="CVBullet"/>
+        <w:numPr>
+          <w:ilvl w:val="0"/>
+          <w:numId w:val="10"/>
+        </w:numPr>
+      </w:pPr>
+      <w:r>
+        <w:t>Design AI-assisted inquiry workflows for evidence search, hypothesis comparison, objection testing, traceability, calibration, and human review.</w:t>
+      </w:r>
+    </w:p>
+    <w:p>
+      <w:pPr>
+        <w:pStyle w:val="CVBullet"/>
+        <w:numPr>
+          <w:ilvl w:val="0"/>
+          <w:numId w:val="10"/>
+        </w:numPr>
+      </w:pPr>
+      <w:r>
+        <w:t>Provide individualized life coaching alongside academic and professional-development services.</w:t>
       </w:r>
     </w:p>
     <w:p>
@@ -926,7 +944,7 @@
         </w:numPr>
       </w:pPr>
       <w:r>
-        <w:t>Instructional technology; practical AI applications; prompt design; Canva; Google Drive; data analytics</w:t>
+        <w:t>Expert-level AI prompting and use-case design for research, education, writing, and public reasoning</w:t>
       </w:r>
     </w:p>
     <w:p>
@@ -938,7 +956,7 @@
         </w:numPr>
       </w:pPr>
       <w:r>
-        <w:t>Agentic AI workflows for building websites, developing tools, and producing instructional materials</w:t>
+        <w:t>Agentic AI workflows for websites, tools, instructional materials, and AI-assisted inquiry with traceability, calibration, and human review</w:t>
       </w:r>
     </w:p>
     <w:p>
@@ -950,7 +968,7 @@
         </w:numPr>
       </w:pPr>
       <w:r>
-        <w:t>Microsoft Word and Excel macro design; Perl programming for a B2B application</w:t>
+        <w:t>Instructional technology; Canva; Google Drive; data analytics; Microsoft Word and Excel macro design; Perl programming for a B2B application</w:t>
       </w:r>
     </w:p>
     <w:p>
@@ -1038,7 +1056,7 @@
         </w:numPr>
       </w:pPr>
       <w:r>
-        <w:t>Served five years as a Speech &amp; Debate Judge for the national Japan Customs Bureau contest, including as Chief Judge from 2016 to 2017.</w:t>
+        <w:t>Five-year judge for the national Japan Customs Bureau Speech &amp; Debate Contest; Chief Judge, 2016-2017.</w:t>
       </w:r>
     </w:p>
     <w:p>
@@ -1127,6 +1145,48 @@
         </w:rPr>
         <w:t>SELECTED WEBSITES</w:t>
       </w:r>
+    </w:p>
+    <w:p>
+      <w:pPr>
+        <w:pStyle w:val="CVSummary"/>
+        <w:keepLines/>
+        <w:tabs>
+          <w:tab w:pos="2520" w:val="left"/>
+          <w:tab w:pos="2520" w:val="left"/>
+        </w:tabs>
+        <w:spacing w:before="0" w:after="20" w:line="240" w:lineRule="auto"/>
+        <w:ind w:left="2520" w:hanging="2520"/>
+      </w:pPr>
+      <w:r>
+        <w:rPr>
+          <w:rFonts w:ascii="Calibri" w:hAnsi="Calibri"/>
+          <w:b/>
+          <w:color w:val="17324D"/>
+          <w:sz w:val="18"/>
+        </w:rPr>
+        <w:t>Primary portfolio</w:t>
+      </w:r>
+      <w:r>
+        <w:rPr>
+          <w:rFonts w:ascii="Calibri" w:hAnsi="Calibri"/>
+          <w:b w:val="0"/>
+          <w:color w:val="5D6A75"/>
+          <w:sz w:val="17"/>
+        </w:rPr>
+        <w:tab/>
+      </w:r>
+      <w:hyperlink r:id="rId12">
+        <w:r>
+          <w:rPr>
+            <w:rFonts w:ascii="Calibri" w:hAnsi="Calibri"/>
+            <w:color w:val="087E8B"/>
+            <w:sz w:val="17"/>
+            <w:b/>
+            <w:u w:val="none"/>
+          </w:rPr>
+          <w:t>https://philstilwell.com</w:t>
+        </w:r>
+      </w:hyperlink>
     </w:p>
     <w:p>
       <w:pPr>
@@ -1573,7 +1633,7 @@
         <w:pStyle w:val="CVSummary"/>
       </w:pPr>
       <w:r>
-        <w:t>Philosophy of science  |  Epistemology, induction, and credencing  |  Critical thinking  |  Economic modeling  |  Cognitive science  |  Trends in Christian thought and practice  |  Cycling  |  Community event planning</w:t>
+        <w:t>Philosophy of science  |  Epistemology, induction &amp; credencing  |  Critical thinking  |  AI-mediated inquiry  |  Economic modeling  |  Cognitive science  |  Christian thought &amp; practice  |  Cycling  |  Community event planning</w:t>
       </w:r>
     </w:p>
     <w:sectPr>

</xml_diff>

<commit_message>
Center CV AI work on educational design
</commit_message>
<xml_diff>
--- a/output/docx/Phil_Stilwell_Modern_CV.docx
+++ b/output/docx/Phil_Stilwell_Modern_CV.docx
@@ -21,7 +21,7 @@
         <w:pStyle w:val="CVHeadline"/>
       </w:pPr>
       <w:r>
-        <w:t>Educator  |  Curriculum Designer  |  AI Prompting &amp; Agentic Workflow Specialist</w:t>
+        <w:t>Educator  |  Curriculum Designer  |  AI Specialist for Educational Programs &amp; Tools</w:t>
       </w:r>
     </w:p>
     <w:p>
@@ -74,7 +74,7 @@
         <w:pStyle w:val="CVSummary"/>
       </w:pPr>
       <w:r>
-        <w:t>Educator, curriculum designer, and academic and technical writing specialist with 25+ years of experience across universities, corporations, and government institutions in Japan. Expert in AI prompting, use-case design, and agentic workflows for research, education, writing, website creation, tool development, and instructional materials. Applies AI to evidence search, hypothesis comparison, objection testing, traceability, calibration, and human-reviewed inquiry, alongside deep experience in graduate-school preparation, English-medium instruction, corporate training, and technology-enhanced learning.</w:t>
+        <w:t>Educator, curriculum designer, and academic and technical writing specialist with 25+ years of experience across universities, corporations, and government institutions in Japan. Expert in AI prompting, use-case design, and agentic workflows, applied primarily to the design of educational programs, learning tools, websites, and instructional materials. Also applies AI to evidence search, hypothesis comparison, objection testing, traceability, calibration, and human-reviewed inquiry, alongside deep experience in graduate-school preparation, English-medium instruction, corporate training, and technology-enhanced learning.</w:t>
       </w:r>
     </w:p>
     <w:p>
@@ -180,7 +180,7 @@
         </w:numPr>
       </w:pPr>
       <w:r>
-        <w:t>Teach and apply advanced AI prompting, use-case design, and agentic workflows for research, writing, website creation, tool development, and instructional materials.</w:t>
+        <w:t>Teach and apply advanced AI prompting, use-case design, and agentic workflows, primarily in the creation of educational programs, learning tools, websites, and instructional materials.</w:t>
       </w:r>
     </w:p>
     <w:p>
@@ -944,7 +944,7 @@
         </w:numPr>
       </w:pPr>
       <w:r>
-        <w:t>Expert-level AI prompting and use-case design for research, education, writing, and public reasoning</w:t>
+        <w:t>Expert-level AI prompting and use-case design, applied primarily to educational program and tool development</w:t>
       </w:r>
     </w:p>
     <w:p>
@@ -956,7 +956,7 @@
         </w:numPr>
       </w:pPr>
       <w:r>
-        <w:t>Agentic AI workflows for websites, tools, instructional materials, and AI-assisted inquiry with traceability, calibration, and human review</w:t>
+        <w:t>Agentic workflows for building learning websites, instructional materials, and human-reviewed inquiry systems</w:t>
       </w:r>
     </w:p>
     <w:p>

</xml_diff>